<commit_message>
added use case diagram in SDS
</commit_message>
<xml_diff>
--- a/DIAGRAMS_to_make.docx
+++ b/DIAGRAMS_to_make.docx
@@ -199,6 +199,30 @@
           <w:szCs w:val="30"/>
         </w:rPr>
         <w:t>1.2 Activity Diagrams</w:t>
+      </w:r>
+      <w:r>
+        <w:rPr>
+          <w:rFonts w:ascii="Segoe UI" w:eastAsia="Times New Roman" w:hAnsi="Segoe UI" w:cs="Segoe UI"/>
+          <w:b/>
+          <w:bCs/>
+          <w:color w:val="0F1115"/>
+          <w:sz w:val="30"/>
+          <w:szCs w:val="30"/>
+        </w:rPr>
+        <w:t xml:space="preserve"> (Use case specification</w:t>
+      </w:r>
+      <w:bookmarkStart w:id="0" w:name="_GoBack"/>
+      <w:bookmarkEnd w:id="0"/>
+      <w:r>
+        <w:rPr>
+          <w:rFonts w:ascii="Segoe UI" w:eastAsia="Times New Roman" w:hAnsi="Segoe UI" w:cs="Segoe UI"/>
+          <w:b/>
+          <w:bCs/>
+          <w:color w:val="0F1115"/>
+          <w:sz w:val="30"/>
+          <w:szCs w:val="30"/>
+        </w:rPr>
+        <w:t>)</w:t>
       </w:r>
     </w:p>
     <w:tbl>
@@ -482,7 +506,25 @@
                 <w:sz w:val="23"/>
                 <w:szCs w:val="23"/>
               </w:rPr>
-              <w:t>Rider ticks products → uploads bill → enters shopkeeper details → client emergency notification → accept/reject → payment release.</w:t>
+              <w:t xml:space="preserve">Rider </w:t>
+            </w:r>
+            <w:proofErr w:type="gramStart"/>
+            <w:r>
+              <w:rPr>
+                <w:rFonts w:ascii="Segoe UI" w:eastAsia="Times New Roman" w:hAnsi="Segoe UI" w:cs="Segoe UI"/>
+                <w:sz w:val="23"/>
+                <w:szCs w:val="23"/>
+              </w:rPr>
+              <w:t>ticks</w:t>
+            </w:r>
+            <w:proofErr w:type="gramEnd"/>
+            <w:r>
+              <w:rPr>
+                <w:rFonts w:ascii="Segoe UI" w:eastAsia="Times New Roman" w:hAnsi="Segoe UI" w:cs="Segoe UI"/>
+                <w:sz w:val="23"/>
+                <w:szCs w:val="23"/>
+              </w:rPr>
+              <w:t xml:space="preserve"> products → uploads bill → enters shopkeeper details → client emergency notification → accept/reject → payment release.</w:t>
             </w:r>
           </w:p>
         </w:tc>
@@ -928,7 +970,25 @@
                 <w:sz w:val="23"/>
                 <w:szCs w:val="23"/>
               </w:rPr>
-              <w:t>Rider app → Trip Service → Route Optimisation Engine → Shop Service → Order Service.</w:t>
+              <w:t xml:space="preserve">Rider app → Trip Service → Route </w:t>
+            </w:r>
+            <w:proofErr w:type="spellStart"/>
+            <w:r>
+              <w:rPr>
+                <w:rFonts w:ascii="Segoe UI" w:eastAsia="Times New Roman" w:hAnsi="Segoe UI" w:cs="Segoe UI"/>
+                <w:sz w:val="23"/>
+                <w:szCs w:val="23"/>
+              </w:rPr>
+              <w:t>Optimisation</w:t>
+            </w:r>
+            <w:proofErr w:type="spellEnd"/>
+            <w:r>
+              <w:rPr>
+                <w:rFonts w:ascii="Segoe UI" w:eastAsia="Times New Roman" w:hAnsi="Segoe UI" w:cs="Segoe UI"/>
+                <w:sz w:val="23"/>
+                <w:szCs w:val="23"/>
+              </w:rPr>
+              <w:t xml:space="preserve"> Engine → Shop Service → Order Service.</w:t>
             </w:r>
           </w:p>
         </w:tc>
@@ -1069,7 +1129,25 @@
                 <w:sz w:val="23"/>
                 <w:szCs w:val="23"/>
               </w:rPr>
-              <w:t>Client dashboard → Profit Sharing Service → Wallet Service → Bank Gateway (tokenised).</w:t>
+              <w:t>Client dashboard → Profit Sharing Service → Wallet Service → Bank Gateway (</w:t>
+            </w:r>
+            <w:proofErr w:type="spellStart"/>
+            <w:r>
+              <w:rPr>
+                <w:rFonts w:ascii="Segoe UI" w:eastAsia="Times New Roman" w:hAnsi="Segoe UI" w:cs="Segoe UI"/>
+                <w:sz w:val="23"/>
+                <w:szCs w:val="23"/>
+              </w:rPr>
+              <w:t>tokenised</w:t>
+            </w:r>
+            <w:proofErr w:type="spellEnd"/>
+            <w:r>
+              <w:rPr>
+                <w:rFonts w:ascii="Segoe UI" w:eastAsia="Times New Roman" w:hAnsi="Segoe UI" w:cs="Segoe UI"/>
+                <w:sz w:val="23"/>
+                <w:szCs w:val="23"/>
+              </w:rPr>
+              <w:t>).</w:t>
             </w:r>
           </w:p>
         </w:tc>
@@ -1607,7 +1685,147 @@
           <w:sz w:val="24"/>
           <w:szCs w:val="24"/>
         </w:rPr>
-        <w:t> User (abstract), Customer, Rider, Client, Base, Shop, Product, ProductType, ProductStock, Order, OrderItem, Trip, TripStop, Complaint, Feedback, WalletTransaction, Configuration, Budget, Plan, DiscountEvent, WishlistItem.</w:t>
+        <w:t xml:space="preserve"> User (abstract), Customer, Rider, Client, Base, Shop, Product, </w:t>
+      </w:r>
+      <w:proofErr w:type="spellStart"/>
+      <w:r>
+        <w:rPr>
+          <w:rFonts w:ascii="Segoe UI" w:eastAsia="Times New Roman" w:hAnsi="Segoe UI" w:cs="Segoe UI"/>
+          <w:color w:val="0F1115"/>
+          <w:sz w:val="24"/>
+          <w:szCs w:val="24"/>
+        </w:rPr>
+        <w:t>ProductType</w:t>
+      </w:r>
+      <w:proofErr w:type="spellEnd"/>
+      <w:r>
+        <w:rPr>
+          <w:rFonts w:ascii="Segoe UI" w:eastAsia="Times New Roman" w:hAnsi="Segoe UI" w:cs="Segoe UI"/>
+          <w:color w:val="0F1115"/>
+          <w:sz w:val="24"/>
+          <w:szCs w:val="24"/>
+        </w:rPr>
+        <w:t xml:space="preserve">, </w:t>
+      </w:r>
+      <w:proofErr w:type="spellStart"/>
+      <w:r>
+        <w:rPr>
+          <w:rFonts w:ascii="Segoe UI" w:eastAsia="Times New Roman" w:hAnsi="Segoe UI" w:cs="Segoe UI"/>
+          <w:color w:val="0F1115"/>
+          <w:sz w:val="24"/>
+          <w:szCs w:val="24"/>
+        </w:rPr>
+        <w:t>ProductStock</w:t>
+      </w:r>
+      <w:proofErr w:type="spellEnd"/>
+      <w:r>
+        <w:rPr>
+          <w:rFonts w:ascii="Segoe UI" w:eastAsia="Times New Roman" w:hAnsi="Segoe UI" w:cs="Segoe UI"/>
+          <w:color w:val="0F1115"/>
+          <w:sz w:val="24"/>
+          <w:szCs w:val="24"/>
+        </w:rPr>
+        <w:t xml:space="preserve">, Order, </w:t>
+      </w:r>
+      <w:proofErr w:type="spellStart"/>
+      <w:r>
+        <w:rPr>
+          <w:rFonts w:ascii="Segoe UI" w:eastAsia="Times New Roman" w:hAnsi="Segoe UI" w:cs="Segoe UI"/>
+          <w:color w:val="0F1115"/>
+          <w:sz w:val="24"/>
+          <w:szCs w:val="24"/>
+        </w:rPr>
+        <w:t>OrderItem</w:t>
+      </w:r>
+      <w:proofErr w:type="spellEnd"/>
+      <w:r>
+        <w:rPr>
+          <w:rFonts w:ascii="Segoe UI" w:eastAsia="Times New Roman" w:hAnsi="Segoe UI" w:cs="Segoe UI"/>
+          <w:color w:val="0F1115"/>
+          <w:sz w:val="24"/>
+          <w:szCs w:val="24"/>
+        </w:rPr>
+        <w:t xml:space="preserve">, Trip, </w:t>
+      </w:r>
+      <w:proofErr w:type="spellStart"/>
+      <w:r>
+        <w:rPr>
+          <w:rFonts w:ascii="Segoe UI" w:eastAsia="Times New Roman" w:hAnsi="Segoe UI" w:cs="Segoe UI"/>
+          <w:color w:val="0F1115"/>
+          <w:sz w:val="24"/>
+          <w:szCs w:val="24"/>
+        </w:rPr>
+        <w:t>TripStop</w:t>
+      </w:r>
+      <w:proofErr w:type="spellEnd"/>
+      <w:r>
+        <w:rPr>
+          <w:rFonts w:ascii="Segoe UI" w:eastAsia="Times New Roman" w:hAnsi="Segoe UI" w:cs="Segoe UI"/>
+          <w:color w:val="0F1115"/>
+          <w:sz w:val="24"/>
+          <w:szCs w:val="24"/>
+        </w:rPr>
+        <w:t xml:space="preserve">, Complaint, Feedback, </w:t>
+      </w:r>
+      <w:proofErr w:type="spellStart"/>
+      <w:r>
+        <w:rPr>
+          <w:rFonts w:ascii="Segoe UI" w:eastAsia="Times New Roman" w:hAnsi="Segoe UI" w:cs="Segoe UI"/>
+          <w:color w:val="0F1115"/>
+          <w:sz w:val="24"/>
+          <w:szCs w:val="24"/>
+        </w:rPr>
+        <w:t>WalletTransaction</w:t>
+      </w:r>
+      <w:proofErr w:type="spellEnd"/>
+      <w:r>
+        <w:rPr>
+          <w:rFonts w:ascii="Segoe UI" w:eastAsia="Times New Roman" w:hAnsi="Segoe UI" w:cs="Segoe UI"/>
+          <w:color w:val="0F1115"/>
+          <w:sz w:val="24"/>
+          <w:szCs w:val="24"/>
+        </w:rPr>
+        <w:t xml:space="preserve">, Configuration, Budget, Plan, </w:t>
+      </w:r>
+      <w:proofErr w:type="spellStart"/>
+      <w:r>
+        <w:rPr>
+          <w:rFonts w:ascii="Segoe UI" w:eastAsia="Times New Roman" w:hAnsi="Segoe UI" w:cs="Segoe UI"/>
+          <w:color w:val="0F1115"/>
+          <w:sz w:val="24"/>
+          <w:szCs w:val="24"/>
+        </w:rPr>
+        <w:t>DiscountEvent</w:t>
+      </w:r>
+      <w:proofErr w:type="spellEnd"/>
+      <w:r>
+        <w:rPr>
+          <w:rFonts w:ascii="Segoe UI" w:eastAsia="Times New Roman" w:hAnsi="Segoe UI" w:cs="Segoe UI"/>
+          <w:color w:val="0F1115"/>
+          <w:sz w:val="24"/>
+          <w:szCs w:val="24"/>
+        </w:rPr>
+        <w:t xml:space="preserve">, </w:t>
+      </w:r>
+      <w:proofErr w:type="spellStart"/>
+      <w:r>
+        <w:rPr>
+          <w:rFonts w:ascii="Segoe UI" w:eastAsia="Times New Roman" w:hAnsi="Segoe UI" w:cs="Segoe UI"/>
+          <w:color w:val="0F1115"/>
+          <w:sz w:val="24"/>
+          <w:szCs w:val="24"/>
+        </w:rPr>
+        <w:t>WishlistItem</w:t>
+      </w:r>
+      <w:proofErr w:type="spellEnd"/>
+      <w:r>
+        <w:rPr>
+          <w:rFonts w:ascii="Segoe UI" w:eastAsia="Times New Roman" w:hAnsi="Segoe UI" w:cs="Segoe UI"/>
+          <w:color w:val="0F1115"/>
+          <w:sz w:val="24"/>
+          <w:szCs w:val="24"/>
+        </w:rPr>
+        <w:t>.</w:t>
       </w:r>
     </w:p>
     <w:p>
@@ -1644,7 +1862,27 @@
           <w:sz w:val="24"/>
           <w:szCs w:val="24"/>
         </w:rPr>
-        <w:t> Inheritance (User → Customer/Rider/Client), associations (Order → Customer, Trip → Rider, Shop → Base, ProductStock → Product + Shop).</w:t>
+        <w:t xml:space="preserve"> Inheritance (User → Customer/Rider/Client), associations (Order → Customer, Trip → Rider, Shop → Base, </w:t>
+      </w:r>
+      <w:proofErr w:type="spellStart"/>
+      <w:r>
+        <w:rPr>
+          <w:rFonts w:ascii="Segoe UI" w:eastAsia="Times New Roman" w:hAnsi="Segoe UI" w:cs="Segoe UI"/>
+          <w:color w:val="0F1115"/>
+          <w:sz w:val="24"/>
+          <w:szCs w:val="24"/>
+        </w:rPr>
+        <w:t>ProductStock</w:t>
+      </w:r>
+      <w:proofErr w:type="spellEnd"/>
+      <w:r>
+        <w:rPr>
+          <w:rFonts w:ascii="Segoe UI" w:eastAsia="Times New Roman" w:hAnsi="Segoe UI" w:cs="Segoe UI"/>
+          <w:color w:val="0F1115"/>
+          <w:sz w:val="24"/>
+          <w:szCs w:val="24"/>
+        </w:rPr>
+        <w:t xml:space="preserve"> → Product + Shop).</w:t>
       </w:r>
     </w:p>
     <w:p>
@@ -1720,6 +1958,7 @@
         </w:rPr>
         <w:t> </w:t>
       </w:r>
+      <w:proofErr w:type="gramStart"/>
       <w:r>
         <w:rPr>
           <w:rFonts w:ascii="Consolas" w:eastAsia="Times New Roman" w:hAnsi="Consolas" w:cs="Courier New"/>
@@ -1728,7 +1967,18 @@
           <w:szCs w:val="20"/>
           <w:shd w:val="clear" w:color="auto" w:fill="EBEEF2"/>
         </w:rPr>
-        <w:t>calculateRoute()</w:t>
+        <w:t>calculateRoute(</w:t>
+      </w:r>
+      <w:proofErr w:type="gramEnd"/>
+      <w:r>
+        <w:rPr>
+          <w:rFonts w:ascii="Consolas" w:eastAsia="Times New Roman" w:hAnsi="Consolas" w:cs="Courier New"/>
+          <w:color w:val="0F1115"/>
+          <w:sz w:val="20"/>
+          <w:szCs w:val="20"/>
+          <w:shd w:val="clear" w:color="auto" w:fill="EBEEF2"/>
+        </w:rPr>
+        <w:t>)</w:t>
       </w:r>
       <w:r>
         <w:rPr>
@@ -1848,6 +2098,8 @@
         </w:rPr>
         <w:t>Tables for all entities above with primary/foreign keys, indexes (e.g., on </w:t>
       </w:r>
+      <w:proofErr w:type="spellStart"/>
+      <w:proofErr w:type="gramStart"/>
       <w:r>
         <w:rPr>
           <w:rFonts w:ascii="Consolas" w:eastAsia="Times New Roman" w:hAnsi="Consolas" w:cs="Courier New"/>
@@ -1858,6 +2110,8 @@
         </w:rPr>
         <w:t>order.status</w:t>
       </w:r>
+      <w:proofErr w:type="spellEnd"/>
+      <w:proofErr w:type="gramEnd"/>
       <w:r>
         <w:rPr>
           <w:rFonts w:ascii="Segoe UI" w:eastAsia="Times New Roman" w:hAnsi="Segoe UI" w:cs="Segoe UI"/>
@@ -1867,6 +2121,7 @@
         </w:rPr>
         <w:t>, </w:t>
       </w:r>
+      <w:proofErr w:type="spellStart"/>
       <w:r>
         <w:rPr>
           <w:rFonts w:ascii="Consolas" w:eastAsia="Times New Roman" w:hAnsi="Consolas" w:cs="Courier New"/>
@@ -1877,6 +2132,7 @@
         </w:rPr>
         <w:t>trip.rider_id</w:t>
       </w:r>
+      <w:proofErr w:type="spellEnd"/>
       <w:r>
         <w:rPr>
           <w:rFonts w:ascii="Segoe UI" w:eastAsia="Times New Roman" w:hAnsi="Segoe UI" w:cs="Segoe UI"/>
@@ -1886,6 +2142,7 @@
         </w:rPr>
         <w:t>, </w:t>
       </w:r>
+      <w:proofErr w:type="spellStart"/>
       <w:r>
         <w:rPr>
           <w:rFonts w:ascii="Consolas" w:eastAsia="Times New Roman" w:hAnsi="Consolas" w:cs="Courier New"/>
@@ -1896,6 +2153,7 @@
         </w:rPr>
         <w:t>product_search_vector</w:t>
       </w:r>
+      <w:proofErr w:type="spellEnd"/>
       <w:r>
         <w:rPr>
           <w:rFonts w:ascii="Segoe UI" w:eastAsia="Times New Roman" w:hAnsi="Segoe UI" w:cs="Segoe UI"/>
@@ -1969,7 +2227,27 @@
           <w:szCs w:val="24"/>
         </w:rPr>
         <w:noBreakHyphen/>
-        <w:t>many (Product ↔ Shop via ProductStock).</w:t>
+        <w:t xml:space="preserve">many (Product ↔ Shop via </w:t>
+      </w:r>
+      <w:proofErr w:type="spellStart"/>
+      <w:r>
+        <w:rPr>
+          <w:rFonts w:ascii="Segoe UI" w:eastAsia="Times New Roman" w:hAnsi="Segoe UI" w:cs="Segoe UI"/>
+          <w:color w:val="0F1115"/>
+          <w:sz w:val="24"/>
+          <w:szCs w:val="24"/>
+        </w:rPr>
+        <w:t>ProductStock</w:t>
+      </w:r>
+      <w:proofErr w:type="spellEnd"/>
+      <w:r>
+        <w:rPr>
+          <w:rFonts w:ascii="Segoe UI" w:eastAsia="Times New Roman" w:hAnsi="Segoe UI" w:cs="Segoe UI"/>
+          <w:color w:val="0F1115"/>
+          <w:sz w:val="24"/>
+          <w:szCs w:val="24"/>
+        </w:rPr>
+        <w:t>).</w:t>
       </w:r>
     </w:p>
     <w:p>
@@ -2068,7 +2346,27 @@
           <w:sz w:val="24"/>
           <w:szCs w:val="24"/>
         </w:rPr>
-        <w:t> Order Service, Rider Service, Client Service, Payment Service, Wallet Service, Route Optimisation Engine, Notification Service, Discount Engine, Audit Service.</w:t>
+        <w:t xml:space="preserve"> Order Service, Rider Service, Client Service, Payment Service, Wallet Service, Route </w:t>
+      </w:r>
+      <w:proofErr w:type="spellStart"/>
+      <w:r>
+        <w:rPr>
+          <w:rFonts w:ascii="Segoe UI" w:eastAsia="Times New Roman" w:hAnsi="Segoe UI" w:cs="Segoe UI"/>
+          <w:color w:val="0F1115"/>
+          <w:sz w:val="24"/>
+          <w:szCs w:val="24"/>
+        </w:rPr>
+        <w:t>Optimisation</w:t>
+      </w:r>
+      <w:proofErr w:type="spellEnd"/>
+      <w:r>
+        <w:rPr>
+          <w:rFonts w:ascii="Segoe UI" w:eastAsia="Times New Roman" w:hAnsi="Segoe UI" w:cs="Segoe UI"/>
+          <w:color w:val="0F1115"/>
+          <w:sz w:val="24"/>
+          <w:szCs w:val="24"/>
+        </w:rPr>
+        <w:t xml:space="preserve"> Engine, Notification Service, Discount Engine, Audit Service.</w:t>
       </w:r>
     </w:p>
     <w:p>
@@ -2243,7 +2541,27 @@
           <w:sz w:val="24"/>
           <w:szCs w:val="24"/>
         </w:rPr>
-        <w:t> Load balancer (nginx), Spring Boot instances (stateless), PostgreSQL primary + read replicas, Redis cluster, message broker, S3 storage.</w:t>
+        <w:t> Load balancer (</w:t>
+      </w:r>
+      <w:proofErr w:type="spellStart"/>
+      <w:r>
+        <w:rPr>
+          <w:rFonts w:ascii="Segoe UI" w:eastAsia="Times New Roman" w:hAnsi="Segoe UI" w:cs="Segoe UI"/>
+          <w:color w:val="0F1115"/>
+          <w:sz w:val="24"/>
+          <w:szCs w:val="24"/>
+        </w:rPr>
+        <w:t>nginx</w:t>
+      </w:r>
+      <w:proofErr w:type="spellEnd"/>
+      <w:r>
+        <w:rPr>
+          <w:rFonts w:ascii="Segoe UI" w:eastAsia="Times New Roman" w:hAnsi="Segoe UI" w:cs="Segoe UI"/>
+          <w:color w:val="0F1115"/>
+          <w:sz w:val="24"/>
+          <w:szCs w:val="24"/>
+        </w:rPr>
+        <w:t>), Spring Boot instances (stateless), PostgreSQL primary + read replicas, Redis cluster, message broker, S3 storage.</w:t>
       </w:r>
     </w:p>
     <w:p>
@@ -2415,7 +2733,17 @@
           <w:sz w:val="24"/>
           <w:szCs w:val="24"/>
         </w:rPr>
-        <w:t> – shows messages between </w:t>
+        <w:t xml:space="preserve"> – shows messages </w:t>
+      </w:r>
+      <w:proofErr w:type="gramStart"/>
+      <w:r>
+        <w:rPr>
+          <w:rFonts w:ascii="Segoe UI" w:eastAsia="Times New Roman" w:hAnsi="Segoe UI" w:cs="Segoe UI"/>
+          <w:color w:val="0F1115"/>
+          <w:sz w:val="24"/>
+          <w:szCs w:val="24"/>
+        </w:rPr>
+        <w:t>between </w:t>
       </w:r>
       <w:r>
         <w:rPr>
@@ -2427,6 +2755,7 @@
         </w:rPr>
         <w:t>:Customer</w:t>
       </w:r>
+      <w:proofErr w:type="gramEnd"/>
       <w:r>
         <w:rPr>
           <w:rFonts w:ascii="Segoe UI" w:eastAsia="Times New Roman" w:hAnsi="Segoe UI" w:cs="Segoe UI"/>
@@ -2926,7 +3255,67 @@
           <w:sz w:val="24"/>
           <w:szCs w:val="24"/>
         </w:rPr>
-        <w:t> NewClient → API → NotifyAllExistingClients → EachClient approves/rejects → Consensus → Account created or rejection email.</w:t>
+        <w:t> </w:t>
+      </w:r>
+      <w:proofErr w:type="spellStart"/>
+      <w:r>
+        <w:rPr>
+          <w:rFonts w:ascii="Segoe UI" w:eastAsia="Times New Roman" w:hAnsi="Segoe UI" w:cs="Segoe UI"/>
+          <w:color w:val="0F1115"/>
+          <w:sz w:val="24"/>
+          <w:szCs w:val="24"/>
+        </w:rPr>
+        <w:t>NewClient</w:t>
+      </w:r>
+      <w:proofErr w:type="spellEnd"/>
+      <w:r>
+        <w:rPr>
+          <w:rFonts w:ascii="Segoe UI" w:eastAsia="Times New Roman" w:hAnsi="Segoe UI" w:cs="Segoe UI"/>
+          <w:color w:val="0F1115"/>
+          <w:sz w:val="24"/>
+          <w:szCs w:val="24"/>
+        </w:rPr>
+        <w:t xml:space="preserve"> → API → </w:t>
+      </w:r>
+      <w:proofErr w:type="spellStart"/>
+      <w:r>
+        <w:rPr>
+          <w:rFonts w:ascii="Segoe UI" w:eastAsia="Times New Roman" w:hAnsi="Segoe UI" w:cs="Segoe UI"/>
+          <w:color w:val="0F1115"/>
+          <w:sz w:val="24"/>
+          <w:szCs w:val="24"/>
+        </w:rPr>
+        <w:t>NotifyAllExistingClients</w:t>
+      </w:r>
+      <w:proofErr w:type="spellEnd"/>
+      <w:r>
+        <w:rPr>
+          <w:rFonts w:ascii="Segoe UI" w:eastAsia="Times New Roman" w:hAnsi="Segoe UI" w:cs="Segoe UI"/>
+          <w:color w:val="0F1115"/>
+          <w:sz w:val="24"/>
+          <w:szCs w:val="24"/>
+        </w:rPr>
+        <w:t xml:space="preserve"> → </w:t>
+      </w:r>
+      <w:proofErr w:type="spellStart"/>
+      <w:r>
+        <w:rPr>
+          <w:rFonts w:ascii="Segoe UI" w:eastAsia="Times New Roman" w:hAnsi="Segoe UI" w:cs="Segoe UI"/>
+          <w:color w:val="0F1115"/>
+          <w:sz w:val="24"/>
+          <w:szCs w:val="24"/>
+        </w:rPr>
+        <w:t>EachClient</w:t>
+      </w:r>
+      <w:proofErr w:type="spellEnd"/>
+      <w:r>
+        <w:rPr>
+          <w:rFonts w:ascii="Segoe UI" w:eastAsia="Times New Roman" w:hAnsi="Segoe UI" w:cs="Segoe UI"/>
+          <w:color w:val="0F1115"/>
+          <w:sz w:val="24"/>
+          <w:szCs w:val="24"/>
+        </w:rPr>
+        <w:t xml:space="preserve"> approves/rejects → Consensus → Account created or rejection email.</w:t>
       </w:r>
     </w:p>
     <w:p>
@@ -3068,7 +3457,31 @@
           <w:sz w:val="30"/>
           <w:szCs w:val="30"/>
         </w:rPr>
-        <w:t>4.6 API Contract Diagram (Swagger/OpenAPI overview)</w:t>
+        <w:t>4.6 API Contract Diagram (Swagger/</w:t>
+      </w:r>
+      <w:proofErr w:type="spellStart"/>
+      <w:r>
+        <w:rPr>
+          <w:rFonts w:ascii="Segoe UI" w:eastAsia="Times New Roman" w:hAnsi="Segoe UI" w:cs="Segoe UI"/>
+          <w:b/>
+          <w:bCs/>
+          <w:color w:val="0F1115"/>
+          <w:sz w:val="30"/>
+          <w:szCs w:val="30"/>
+        </w:rPr>
+        <w:t>OpenAPI</w:t>
+      </w:r>
+      <w:proofErr w:type="spellEnd"/>
+      <w:r>
+        <w:rPr>
+          <w:rFonts w:ascii="Segoe UI" w:eastAsia="Times New Roman" w:hAnsi="Segoe UI" w:cs="Segoe UI"/>
+          <w:b/>
+          <w:bCs/>
+          <w:color w:val="0F1115"/>
+          <w:sz w:val="30"/>
+          <w:szCs w:val="30"/>
+        </w:rPr>
+        <w:t xml:space="preserve"> overview)</w:t>
       </w:r>
     </w:p>
     <w:p>
@@ -3172,7 +3585,27 @@
           <w:sz w:val="24"/>
           <w:szCs w:val="24"/>
         </w:rPr>
-        <w:t>TLS termination, API gateway with rate limiting, authentication service (JWT), MFA for clients, tokenisation proxy for payment data, encrypted storage.</w:t>
+        <w:t xml:space="preserve">TLS termination, API gateway with rate limiting, authentication service (JWT), MFA for clients, </w:t>
+      </w:r>
+      <w:proofErr w:type="spellStart"/>
+      <w:r>
+        <w:rPr>
+          <w:rFonts w:ascii="Segoe UI" w:eastAsia="Times New Roman" w:hAnsi="Segoe UI" w:cs="Segoe UI"/>
+          <w:color w:val="0F1115"/>
+          <w:sz w:val="24"/>
+          <w:szCs w:val="24"/>
+        </w:rPr>
+        <w:t>tokenisation</w:t>
+      </w:r>
+      <w:proofErr w:type="spellEnd"/>
+      <w:r>
+        <w:rPr>
+          <w:rFonts w:ascii="Segoe UI" w:eastAsia="Times New Roman" w:hAnsi="Segoe UI" w:cs="Segoe UI"/>
+          <w:color w:val="0F1115"/>
+          <w:sz w:val="24"/>
+          <w:szCs w:val="24"/>
+        </w:rPr>
+        <w:t xml:space="preserve"> proxy for payment data, encrypted storage.</w:t>
       </w:r>
     </w:p>
     <w:p>
@@ -3287,7 +3720,47 @@
           <w:szCs w:val="24"/>
         </w:rPr>
         <w:noBreakHyphen/>
-        <w:t>once) → queryable by authorised clients.</w:t>
+        <w:t xml:space="preserve">once) → </w:t>
+      </w:r>
+      <w:proofErr w:type="spellStart"/>
+      <w:r>
+        <w:rPr>
+          <w:rFonts w:ascii="Segoe UI" w:eastAsia="Times New Roman" w:hAnsi="Segoe UI" w:cs="Segoe UI"/>
+          <w:color w:val="0F1115"/>
+          <w:sz w:val="24"/>
+          <w:szCs w:val="24"/>
+        </w:rPr>
+        <w:t>queryable</w:t>
+      </w:r>
+      <w:proofErr w:type="spellEnd"/>
+      <w:r>
+        <w:rPr>
+          <w:rFonts w:ascii="Segoe UI" w:eastAsia="Times New Roman" w:hAnsi="Segoe UI" w:cs="Segoe UI"/>
+          <w:color w:val="0F1115"/>
+          <w:sz w:val="24"/>
+          <w:szCs w:val="24"/>
+        </w:rPr>
+        <w:t xml:space="preserve"> by </w:t>
+      </w:r>
+      <w:proofErr w:type="spellStart"/>
+      <w:r>
+        <w:rPr>
+          <w:rFonts w:ascii="Segoe UI" w:eastAsia="Times New Roman" w:hAnsi="Segoe UI" w:cs="Segoe UI"/>
+          <w:color w:val="0F1115"/>
+          <w:sz w:val="24"/>
+          <w:szCs w:val="24"/>
+        </w:rPr>
+        <w:t>authorised</w:t>
+      </w:r>
+      <w:proofErr w:type="spellEnd"/>
+      <w:r>
+        <w:rPr>
+          <w:rFonts w:ascii="Segoe UI" w:eastAsia="Times New Roman" w:hAnsi="Segoe UI" w:cs="Segoe UI"/>
+          <w:color w:val="0F1115"/>
+          <w:sz w:val="24"/>
+          <w:szCs w:val="24"/>
+        </w:rPr>
+        <w:t xml:space="preserve"> clients.</w:t>
       </w:r>
     </w:p>
     <w:p>
@@ -3339,7 +3812,31 @@
           <w:sz w:val="30"/>
           <w:szCs w:val="30"/>
         </w:rPr>
-        <w:t>6.1 Wireflow (User Flow Diagrams)</w:t>
+        <w:t xml:space="preserve">6.1 </w:t>
+      </w:r>
+      <w:proofErr w:type="spellStart"/>
+      <w:r>
+        <w:rPr>
+          <w:rFonts w:ascii="Segoe UI" w:eastAsia="Times New Roman" w:hAnsi="Segoe UI" w:cs="Segoe UI"/>
+          <w:b/>
+          <w:bCs/>
+          <w:color w:val="0F1115"/>
+          <w:sz w:val="30"/>
+          <w:szCs w:val="30"/>
+        </w:rPr>
+        <w:t>Wireflow</w:t>
+      </w:r>
+      <w:proofErr w:type="spellEnd"/>
+      <w:r>
+        <w:rPr>
+          <w:rFonts w:ascii="Segoe UI" w:eastAsia="Times New Roman" w:hAnsi="Segoe UI" w:cs="Segoe UI"/>
+          <w:b/>
+          <w:bCs/>
+          <w:color w:val="0F1115"/>
+          <w:sz w:val="30"/>
+          <w:szCs w:val="30"/>
+        </w:rPr>
+        <w:t xml:space="preserve"> (User Flow Diagrams)</w:t>
       </w:r>
     </w:p>
     <w:p>
@@ -3580,7 +4077,27 @@
           <w:sz w:val="24"/>
           <w:szCs w:val="24"/>
         </w:rPr>
-        <w:t>Full details with cardinality (e.g., one Rider has many Trips, one Trip has many OrderItems).</w:t>
+        <w:t xml:space="preserve">Full details with cardinality (e.g., one Rider has many Trips, one Trip has many </w:t>
+      </w:r>
+      <w:proofErr w:type="spellStart"/>
+      <w:r>
+        <w:rPr>
+          <w:rFonts w:ascii="Segoe UI" w:eastAsia="Times New Roman" w:hAnsi="Segoe UI" w:cs="Segoe UI"/>
+          <w:color w:val="0F1115"/>
+          <w:sz w:val="24"/>
+          <w:szCs w:val="24"/>
+        </w:rPr>
+        <w:t>OrderItems</w:t>
+      </w:r>
+      <w:proofErr w:type="spellEnd"/>
+      <w:r>
+        <w:rPr>
+          <w:rFonts w:ascii="Segoe UI" w:eastAsia="Times New Roman" w:hAnsi="Segoe UI" w:cs="Segoe UI"/>
+          <w:color w:val="0F1115"/>
+          <w:sz w:val="24"/>
+          <w:szCs w:val="24"/>
+        </w:rPr>
+        <w:t>).</w:t>
       </w:r>
     </w:p>
     <w:p>
@@ -3825,7 +4342,27 @@
           <w:sz w:val="24"/>
           <w:szCs w:val="24"/>
         </w:rPr>
-        <w:t>Prometheus metrics → Grafana dashboards → Alertmanager → Email/SMS to on</w:t>
+        <w:t xml:space="preserve">Prometheus metrics → Grafana dashboards → </w:t>
+      </w:r>
+      <w:proofErr w:type="spellStart"/>
+      <w:r>
+        <w:rPr>
+          <w:rFonts w:ascii="Segoe UI" w:eastAsia="Times New Roman" w:hAnsi="Segoe UI" w:cs="Segoe UI"/>
+          <w:color w:val="0F1115"/>
+          <w:sz w:val="24"/>
+          <w:szCs w:val="24"/>
+        </w:rPr>
+        <w:t>Alertmanager</w:t>
+      </w:r>
+      <w:proofErr w:type="spellEnd"/>
+      <w:r>
+        <w:rPr>
+          <w:rFonts w:ascii="Segoe UI" w:eastAsia="Times New Roman" w:hAnsi="Segoe UI" w:cs="Segoe UI"/>
+          <w:color w:val="0F1115"/>
+          <w:sz w:val="24"/>
+          <w:szCs w:val="24"/>
+        </w:rPr>
+        <w:t xml:space="preserve"> → Email/SMS to on</w:t>
       </w:r>
       <w:r>
         <w:rPr>
@@ -5296,13 +5833,23 @@
                 <w:szCs w:val="23"/>
               </w:rPr>
             </w:pPr>
+            <w:proofErr w:type="spellStart"/>
             <w:r>
               <w:rPr>
                 <w:rFonts w:ascii="Segoe UI" w:eastAsia="Times New Roman" w:hAnsi="Segoe UI" w:cs="Segoe UI"/>
                 <w:sz w:val="23"/>
                 <w:szCs w:val="23"/>
               </w:rPr>
-              <w:t>Wireflow for each actor</w:t>
+              <w:t>Wireflow</w:t>
+            </w:r>
+            <w:proofErr w:type="spellEnd"/>
+            <w:r>
+              <w:rPr>
+                <w:rFonts w:ascii="Segoe UI" w:eastAsia="Times New Roman" w:hAnsi="Segoe UI" w:cs="Segoe UI"/>
+                <w:sz w:val="23"/>
+                <w:szCs w:val="23"/>
+              </w:rPr>
+              <w:t xml:space="preserve"> for each actor</w:t>
             </w:r>
           </w:p>
         </w:tc>
@@ -5578,18 +6125,7 @@
           <w:sz w:val="24"/>
           <w:szCs w:val="24"/>
         </w:rPr>
-        <w:t> diagr</w:t>
-      </w:r>
-      <w:bookmarkStart w:id="0" w:name="_GoBack"/>
-      <w:bookmarkEnd w:id="0"/>
-      <w:r>
-        <w:rPr>
-          <w:rFonts w:ascii="Segoe UI" w:eastAsia="Times New Roman" w:hAnsi="Segoe UI" w:cs="Segoe UI"/>
-          <w:color w:val="0F1115"/>
-          <w:sz w:val="24"/>
-          <w:szCs w:val="24"/>
-        </w:rPr>
-        <w:t>ams. The rest can be created incrementally as the system evolves.</w:t>
+        <w:t> diagrams. The rest can be created incrementally as the system evolves.</w:t>
       </w:r>
     </w:p>
     <w:p>

</xml_diff>